<commit_message>
Documents partenaires : noms d'applications fictifs
Regeneration des deux documents depuis les fichiers du jeu, apres le
remplacement d'Instagram par Instaclasse et de WhatsApp par Whatsupp.

- doc_textes_partenaires.docx / .html et le guide pedagogique : plus aucune
  marque reelle.
- doc_partenaires.html : nouvelle section 6 documentant le changement et le
  renommage des fichiers ; sections suivantes renumerotees.
- Le tableau d'architecture pointe les nouveaux noms de fichiers.

Co-Authored-By: Claude Opus 5 <noreply@anthropic.com>
Claude-Session: https://claude.ai/code/session_01PLXv2gBFVtsNEh2FcBrGnz
</commit_message>
<xml_diff>
--- a/doc_textes_partenaires.docx
+++ b/doc_textes_partenaires.docx
@@ -58,7 +58,7 @@
           <w:color w:val="999999"/>
           <w:sz w:val="16"/>
         </w:rPr>
-        <w:t>Version du 9 septembre 2026  ·  Usage interne</w:t>
+        <w:t>Version du 10 septembre 2026  ·  Usage interne</w:t>
       </w:r>
     </w:p>
     <w:p>
@@ -288,7 +288,7 @@
               <w:rPr>
                 <w:sz w:val="19"/>
               </w:rPr>
-              <w:t>L'Instagram de Clara</w:t>
+              <w:t>L'Instaclasse de Clara</w:t>
             </w:r>
           </w:p>
         </w:tc>
@@ -346,7 +346,7 @@
               <w:rPr>
                 <w:sz w:val="19"/>
               </w:rPr>
-              <w:t>Le groupe WhatsApp secret</w:t>
+              <w:t>Le groupe Whatsupp secret</w:t>
             </w:r>
           </w:p>
         </w:tc>
@@ -2698,7 +2698,7 @@
         <w:rPr>
           <w:sz w:val="21"/>
         </w:rPr>
-        <w:t>Elle s'ouvre quand le joueur revient sur la Partie 1 après avoir lu le groupe WhatsApp. Le joueur écrit librement ; les mots acceptés sont « tante », « campagne », « havre » et « secret ».</w:t>
+        <w:t>Elle s'ouvre quand le joueur revient sur la Partie 1 après avoir lu le groupe Whatsupp. Le joueur écrit librement ; les mots acceptés sont « tante », « campagne », « havre » et « secret ».</w:t>
       </w:r>
     </w:p>
     <w:p>
@@ -2933,7 +2933,7 @@
           <w:color w:val="F0ECE4"/>
           <w:sz w:val="34"/>
         </w:rPr>
-        <w:t>L'Instagram de Clara</w:t>
+        <w:t>L'Instaclasse de Clara</w:t>
       </w:r>
     </w:p>
     <w:p>
@@ -6040,7 +6040,7 @@
           <w:color w:val="666666"/>
           <w:sz w:val="18"/>
         </w:rPr>
-        <w:t>Un bouton en bas du fil ouvre l'écran du code de l'exercice (4827), qui ouvre la Partie 3. Ce code est présenté comme un dispositif d'exercice : un groupe WhatsApp n'a pas de code d'accès, et Clara n'a jamais pu entrer dans celui-là.</w:t>
+        <w:t>Un bouton en bas du fil ouvre l'écran du code de l'exercice (4827), qui ouvre la Partie 3. Ce code est présenté comme un dispositif d'exercice : un groupe Whatsupp n'a pas de code d'accès, et Clara n'a jamais pu entrer dans celui-là.</w:t>
       </w:r>
     </w:p>
     <w:p>
@@ -7620,7 +7620,7 @@
           <w:color w:val="F0ECE4"/>
           <w:sz w:val="34"/>
         </w:rPr>
-        <w:t>Le groupe WhatsApp secret — « les vrais 4B 🔥 »</w:t>
+        <w:t>Le groupe Whatsupp secret — « les vrais 4B 🔥 »</w:t>
       </w:r>
     </w:p>
     <w:p>
@@ -8110,7 +8110,7 @@
           <w:color w:val="666666"/>
           <w:sz w:val="18"/>
         </w:rPr>
-        <w:t>Enzo a partagé une publication Instagram</w:t>
+        <w:t>Enzo a partagé une publication Instaclasse</w:t>
       </w:r>
     </w:p>
     <w:p>
@@ -8124,7 +8124,7 @@
           <w:color w:val="666666"/>
           <w:sz w:val="18"/>
         </w:rPr>
-        <w:t>[ Publication Instagram partagée dans le groupe : « lever de soleil ce matin 🌅 » ]</w:t>
+        <w:t>[ Publication Instaclasse partagée dans le groupe : « lever de soleil ce matin 🌅 » ]</w:t>
       </w:r>
     </w:p>
     <w:p>
@@ -8996,7 +8996,7 @@
         <w:rPr>
           <w:sz w:val="20"/>
         </w:rPr>
-        <w:t>Pour tester les paramètres de confidentialité d'Instagram</w:t>
+        <w:t>Pour tester les paramètres de confidentialité d'Instaclasse</w:t>
       </w:r>
     </w:p>
     <w:p>

</xml_diff>